<commit_message>
feat(sem4): add question 39 for AuthName authentication realm to apache exam sample
</commit_message>
<xml_diff>
--- a/Aptech_exam_semester_4/Working with Open Source Web Server (Apache)/old exam/apache_exam_sample.docx
+++ b/Aptech_exam_semester_4/Working with Open Source Web Server (Apache)/old exam/apache_exam_sample.docx
@@ -1,8 +1,10 @@
 
 <file path=word/document.xml><?xml version="1.0" encoding="utf-8"?>
-<w:document xmlns:wpc="http://schemas.microsoft.com/office/word/2010/wordprocessingCanvas" xmlns:mc="http://schemas.openxmlformats.org/markup-compatibility/2006" xmlns:o="urn:schemas-microsoft-com:office:office" xmlns:r="http://schemas.openxmlformats.org/officeDocument/2006/relationships" xmlns:m="http://schemas.openxmlformats.org/officeDocument/2006/math" xmlns:v="urn:schemas-microsoft-com:vml" xmlns:wp14="http://schemas.microsoft.com/office/word/2010/wordprocessingDrawing" xmlns:wp="http://schemas.openxmlformats.org/drawingml/2006/wordprocessingDrawing" xmlns:w10="urn:schemas-microsoft-com:office:word" xmlns:w="http://schemas.openxmlformats.org/wordprocessingml/2006/main" xmlns:w14="http://schemas.microsoft.com/office/word/2010/wordml" xmlns:w15="http://schemas.microsoft.com/office/word/2012/wordml" xmlns:wpg="http://schemas.microsoft.com/office/word/2010/wordprocessingGroup" xmlns:wpi="http://schemas.microsoft.com/office/word/2010/wordprocessingInk" xmlns:wne="http://schemas.microsoft.com/office/word/2006/wordml" xmlns:wps="http://schemas.microsoft.com/office/word/2010/wordprocessingShape" mc:Ignorable="w14 w15 wp14">
+<w:document xmlns:wpc="http://schemas.microsoft.com/office/word/2010/wordprocessingCanvas" xmlns:cx="http://schemas.microsoft.com/office/drawing/2014/chartex" xmlns:cx1="http://schemas.microsoft.com/office/drawing/2015/9/8/chartex" xmlns:mc="http://schemas.openxmlformats.org/markup-compatibility/2006" xmlns:o="urn:schemas-microsoft-com:office:office" xmlns:r="http://schemas.openxmlformats.org/officeDocument/2006/relationships" xmlns:m="http://schemas.openxmlformats.org/officeDocument/2006/math" xmlns:v="urn:schemas-microsoft-com:vml" xmlns:wp14="http://schemas.microsoft.com/office/word/2010/wordprocessingDrawing" xmlns:wp="http://schemas.openxmlformats.org/drawingml/2006/wordprocessingDrawing" xmlns:w10="urn:schemas-microsoft-com:office:word" xmlns:w="http://schemas.openxmlformats.org/wordprocessingml/2006/main" xmlns:w14="http://schemas.microsoft.com/office/word/2010/wordml" xmlns:w15="http://schemas.microsoft.com/office/word/2012/wordml" xmlns:w16se="http://schemas.microsoft.com/office/word/2015/wordml/symex" xmlns:wpg="http://schemas.microsoft.com/office/word/2010/wordprocessingGroup" xmlns:wpi="http://schemas.microsoft.com/office/word/2010/wordprocessingInk" xmlns:wne="http://schemas.microsoft.com/office/word/2006/wordml" xmlns:wps="http://schemas.microsoft.com/office/word/2010/wordprocessingShape" mc:Ignorable="w14 w15 w16se wp14">
   <w:body>
     <w:p>
+      <w:bookmarkStart w:id="0" w:name="_GoBack"/>
+      <w:bookmarkEnd w:id="0"/>
       <w:r>
         <w:t>1) Which of the following utilities is used to render a private key for Apache server?</w:t>
       </w:r>
@@ -340,7 +342,6 @@
     </w:p>
     <w:p>
       <w:r>
-        <w:lastRenderedPageBreak/>
         <w:t xml:space="preserve">b) </w:t>
       </w:r>
       <w:r>
@@ -507,7 +508,6 @@
     </w:p>
     <w:p>
       <w:r>
-        <w:lastRenderedPageBreak/>
         <w:t>a) SSlEngine</w:t>
       </w:r>
     </w:p>
@@ -674,7 +674,6 @@
     </w:p>
     <w:p>
       <w:r>
-        <w:lastRenderedPageBreak/>
         <w:t>d) None of them</w:t>
       </w:r>
     </w:p>
@@ -847,7 +846,6 @@
     </w:p>
     <w:p>
       <w:r>
-        <w:lastRenderedPageBreak/>
         <w:t>25) Which of the following directives are used to configure cookies?</w:t>
       </w:r>
     </w:p>
@@ -1032,7 +1030,6 @@
     </w:p>
     <w:p>
       <w:r>
-        <w:lastRenderedPageBreak/>
         <w:t>30) Which of the following directives defines the maximum number of server processes that must be created by Apache web server?</w:t>
       </w:r>
     </w:p>
@@ -1228,7 +1225,6 @@
     </w:p>
     <w:p>
       <w:r>
-        <w:lastRenderedPageBreak/>
         <w:t xml:space="preserve">c) </w:t>
       </w:r>
       <w:r>
@@ -1364,18 +1360,12 @@
     <w:p/>
     <w:p>
       <w:r>
-        <w:t>38</w:t>
-      </w:r>
-      <w:r>
-        <w:t>) Which of the following is a conditional Directive?</w:t>
-      </w:r>
-    </w:p>
-    <w:p>
-      <w:r>
-        <w:t>a)</w:t>
-      </w:r>
-      <w:r>
-        <w:t xml:space="preserve"> </w:t>
+        <w:t>38) Which of the following is a conditional Directive?</w:t>
+      </w:r>
+    </w:p>
+    <w:p>
+      <w:r>
+        <w:t xml:space="preserve">a) </w:t>
       </w:r>
       <w:r>
         <w:rPr>
@@ -1383,8 +1373,93 @@
         </w:rPr>
         <w:t>&lt;IfDefine&gt;</w:t>
       </w:r>
-      <w:bookmarkStart w:id="0" w:name="_GoBack"/>
-      <w:bookmarkEnd w:id="0"/>
+    </w:p>
+    <w:p>
+      <w:r>
+        <w:t>b) &lt;IfModule&gt;</w:t>
+      </w:r>
+    </w:p>
+    <w:p>
+      <w:r>
+        <w:t>c) &lt;IfFile&gt;</w:t>
+      </w:r>
+    </w:p>
+    <w:p>
+      <w:r>
+        <w:t>d) &lt;IfVersion&gt;</w:t>
+      </w:r>
+    </w:p>
+    <w:p/>
+    <w:p>
+      <w:r>
+        <w:t>39) Which of the following code snippets set the authentication realm to security?</w:t>
+      </w:r>
+    </w:p>
+    <w:p>
+      <w:pPr>
+        <w:rPr>
+          <w:rFonts w:ascii="Calibri" w:hAnsi="Calibri" w:cs="Calibri"/>
+        </w:rPr>
+      </w:pPr>
+      <w:r>
+        <w:rPr>
+          <w:rFonts w:ascii="Calibri" w:hAnsi="Calibri" w:cs="Calibri"/>
+        </w:rPr>
+        <w:t xml:space="preserve">a) </w:t>
+      </w:r>
+      <w:r>
+        <w:rPr>
+          <w:rFonts w:ascii="Calibri" w:hAnsi="Calibri" w:cs="Calibri"/>
+          <w:color w:val="00B050"/>
+        </w:rPr>
+        <w:t>AuthName Security</w:t>
+      </w:r>
+    </w:p>
+    <w:p>
+      <w:pPr>
+        <w:rPr>
+          <w:rFonts w:ascii="Calibri" w:hAnsi="Calibri" w:cs="Calibri"/>
+        </w:rPr>
+      </w:pPr>
+      <w:r>
+        <w:rPr>
+          <w:rFonts w:ascii="Calibri" w:hAnsi="Calibri" w:cs="Calibri"/>
+        </w:rPr>
+        <w:t>b) AuthRealm Security</w:t>
+      </w:r>
+    </w:p>
+    <w:p>
+      <w:pPr>
+        <w:rPr>
+          <w:rFonts w:ascii="Calibri" w:hAnsi="Calibri" w:cs="Calibri"/>
+        </w:rPr>
+      </w:pPr>
+      <w:r>
+        <w:rPr>
+          <w:rFonts w:ascii="Calibri" w:hAnsi="Calibri" w:cs="Calibri"/>
+        </w:rPr>
+        <w:t>c) AuthType Security</w:t>
+      </w:r>
+    </w:p>
+    <w:p>
+      <w:pPr>
+        <w:rPr>
+          <w:rFonts w:ascii="Calibri" w:hAnsi="Calibri" w:cs="Calibri"/>
+        </w:rPr>
+      </w:pPr>
+      <w:r>
+        <w:rPr>
+          <w:rFonts w:ascii="Calibri" w:hAnsi="Calibri" w:cs="Calibri"/>
+        </w:rPr>
+        <w:t>d) SetAuthRealm Security</w:t>
+      </w:r>
+    </w:p>
+    <w:p>
+      <w:pPr>
+        <w:rPr>
+          <w:rFonts w:ascii="Calibri" w:hAnsi="Calibri" w:cs="Calibri"/>
+        </w:rPr>
+      </w:pPr>
     </w:p>
     <w:sectPr>
       <w:pgSz w:w="12240" w:h="15840"/>
@@ -1397,7 +1472,7 @@
 </file>
 
 <file path=word/endnotes.xml><?xml version="1.0" encoding="utf-8"?>
-<w:endnotes xmlns:wpc="http://schemas.microsoft.com/office/word/2010/wordprocessingCanvas" xmlns:mc="http://schemas.openxmlformats.org/markup-compatibility/2006" xmlns:o="urn:schemas-microsoft-com:office:office" xmlns:r="http://schemas.openxmlformats.org/officeDocument/2006/relationships" xmlns:m="http://schemas.openxmlformats.org/officeDocument/2006/math" xmlns:v="urn:schemas-microsoft-com:vml" xmlns:wp14="http://schemas.microsoft.com/office/word/2010/wordprocessingDrawing" xmlns:wp="http://schemas.openxmlformats.org/drawingml/2006/wordprocessingDrawing" xmlns:w10="urn:schemas-microsoft-com:office:word" xmlns:w="http://schemas.openxmlformats.org/wordprocessingml/2006/main" xmlns:w14="http://schemas.microsoft.com/office/word/2010/wordml" xmlns:w15="http://schemas.microsoft.com/office/word/2012/wordml" xmlns:wpg="http://schemas.microsoft.com/office/word/2010/wordprocessingGroup" xmlns:wpi="http://schemas.microsoft.com/office/word/2010/wordprocessingInk" xmlns:wne="http://schemas.microsoft.com/office/word/2006/wordml" xmlns:wps="http://schemas.microsoft.com/office/word/2010/wordprocessingShape" mc:Ignorable="w14 w15 wp14">
+<w:endnotes xmlns:wpc="http://schemas.microsoft.com/office/word/2010/wordprocessingCanvas" xmlns:cx="http://schemas.microsoft.com/office/drawing/2014/chartex" xmlns:cx1="http://schemas.microsoft.com/office/drawing/2015/9/8/chartex" xmlns:mc="http://schemas.openxmlformats.org/markup-compatibility/2006" xmlns:o="urn:schemas-microsoft-com:office:office" xmlns:r="http://schemas.openxmlformats.org/officeDocument/2006/relationships" xmlns:m="http://schemas.openxmlformats.org/officeDocument/2006/math" xmlns:v="urn:schemas-microsoft-com:vml" xmlns:wp14="http://schemas.microsoft.com/office/word/2010/wordprocessingDrawing" xmlns:wp="http://schemas.openxmlformats.org/drawingml/2006/wordprocessingDrawing" xmlns:w10="urn:schemas-microsoft-com:office:word" xmlns:w="http://schemas.openxmlformats.org/wordprocessingml/2006/main" xmlns:w14="http://schemas.microsoft.com/office/word/2010/wordml" xmlns:w15="http://schemas.microsoft.com/office/word/2012/wordml" xmlns:w16se="http://schemas.microsoft.com/office/word/2015/wordml/symex" xmlns:wpg="http://schemas.microsoft.com/office/word/2010/wordprocessingGroup" xmlns:wpi="http://schemas.microsoft.com/office/word/2010/wordprocessingInk" xmlns:wne="http://schemas.microsoft.com/office/word/2006/wordml" xmlns:wps="http://schemas.microsoft.com/office/word/2010/wordprocessingShape" mc:Ignorable="w14 w15 w16se wp14">
   <w:endnote w:type="separator" w:id="-1">
     <w:p>
       <w:pPr>
@@ -1422,7 +1497,7 @@
 </file>
 
 <file path=word/footnotes.xml><?xml version="1.0" encoding="utf-8"?>
-<w:footnotes xmlns:wpc="http://schemas.microsoft.com/office/word/2010/wordprocessingCanvas" xmlns:mc="http://schemas.openxmlformats.org/markup-compatibility/2006" xmlns:o="urn:schemas-microsoft-com:office:office" xmlns:r="http://schemas.openxmlformats.org/officeDocument/2006/relationships" xmlns:m="http://schemas.openxmlformats.org/officeDocument/2006/math" xmlns:v="urn:schemas-microsoft-com:vml" xmlns:wp14="http://schemas.microsoft.com/office/word/2010/wordprocessingDrawing" xmlns:wp="http://schemas.openxmlformats.org/drawingml/2006/wordprocessingDrawing" xmlns:w10="urn:schemas-microsoft-com:office:word" xmlns:w="http://schemas.openxmlformats.org/wordprocessingml/2006/main" xmlns:w14="http://schemas.microsoft.com/office/word/2010/wordml" xmlns:w15="http://schemas.microsoft.com/office/word/2012/wordml" xmlns:wpg="http://schemas.microsoft.com/office/word/2010/wordprocessingGroup" xmlns:wpi="http://schemas.microsoft.com/office/word/2010/wordprocessingInk" xmlns:wne="http://schemas.microsoft.com/office/word/2006/wordml" xmlns:wps="http://schemas.microsoft.com/office/word/2010/wordprocessingShape" mc:Ignorable="w14 w15 wp14">
+<w:footnotes xmlns:wpc="http://schemas.microsoft.com/office/word/2010/wordprocessingCanvas" xmlns:cx="http://schemas.microsoft.com/office/drawing/2014/chartex" xmlns:cx1="http://schemas.microsoft.com/office/drawing/2015/9/8/chartex" xmlns:mc="http://schemas.openxmlformats.org/markup-compatibility/2006" xmlns:o="urn:schemas-microsoft-com:office:office" xmlns:r="http://schemas.openxmlformats.org/officeDocument/2006/relationships" xmlns:m="http://schemas.openxmlformats.org/officeDocument/2006/math" xmlns:v="urn:schemas-microsoft-com:vml" xmlns:wp14="http://schemas.microsoft.com/office/word/2010/wordprocessingDrawing" xmlns:wp="http://schemas.openxmlformats.org/drawingml/2006/wordprocessingDrawing" xmlns:w10="urn:schemas-microsoft-com:office:word" xmlns:w="http://schemas.openxmlformats.org/wordprocessingml/2006/main" xmlns:w14="http://schemas.microsoft.com/office/word/2010/wordml" xmlns:w15="http://schemas.microsoft.com/office/word/2012/wordml" xmlns:w16se="http://schemas.microsoft.com/office/word/2015/wordml/symex" xmlns:wpg="http://schemas.microsoft.com/office/word/2010/wordprocessingGroup" xmlns:wpi="http://schemas.microsoft.com/office/word/2010/wordprocessingInk" xmlns:wne="http://schemas.microsoft.com/office/word/2006/wordml" xmlns:wps="http://schemas.microsoft.com/office/word/2010/wordprocessingShape" mc:Ignorable="w14 w15 w16se wp14">
   <w:footnote w:type="separator" w:id="-1">
     <w:p>
       <w:pPr>
@@ -1447,7 +1522,7 @@
 </file>
 
 <file path=word/styles.xml><?xml version="1.0" encoding="utf-8"?>
-<w:styles xmlns:mc="http://schemas.openxmlformats.org/markup-compatibility/2006" xmlns:r="http://schemas.openxmlformats.org/officeDocument/2006/relationships" xmlns:w="http://schemas.openxmlformats.org/wordprocessingml/2006/main" xmlns:w14="http://schemas.microsoft.com/office/word/2010/wordml" xmlns:w15="http://schemas.microsoft.com/office/word/2012/wordml" mc:Ignorable="w14 w15">
+<w:styles xmlns:mc="http://schemas.openxmlformats.org/markup-compatibility/2006" xmlns:r="http://schemas.openxmlformats.org/officeDocument/2006/relationships" xmlns:w="http://schemas.openxmlformats.org/wordprocessingml/2006/main" xmlns:w14="http://schemas.microsoft.com/office/word/2010/wordml" xmlns:w15="http://schemas.microsoft.com/office/word/2012/wordml" xmlns:w16se="http://schemas.microsoft.com/office/word/2015/wordml/symex" mc:Ignorable="w14 w15 w16se">
   <w:docDefaults>
     <w:rPrDefault>
       <w:rPr>

</xml_diff>